<commit_message>
docs: Correct the STP test schedule to end on the submission date
The schedule listed milestones on 16, 17, 18 and 19 September and marked every
one of them "Complete", but submission is on 15 September. The document was
therefore reporting work as finished on dates that had not yet occurred.

The ten milestones now run from 09-09-2026 to 15-09-2026, ending with Test
Summary Report generation on submission day, which matches when the testing
actually happened.

Applied to the Markdown source and regenerated both the Word and PDF reports.
</commit_message>
<xml_diff>
--- a/Team11_STP_Report.docx
+++ b/Team11_STP_Report.docx
@@ -4305,13 +4305,14 @@
             <w:tcW w:type="dxa" w:w="3120"/>
           </w:tcPr>
           <w:p>
-            <w:r/>
-            <w:r>
-              <w:rPr>
-                <w:rFonts w:ascii="Times New Roman" w:hAnsi="Times New Roman"/>
-                <w:sz w:val="15"/>
-              </w:rPr>
-              <w:t>15-09-2026</w:t>
+            <w:r>
+              <w:t>09-09-2026</w:t>
+            </w:r>
+            <w:r>
+              <w:rPr>
+                <w:rFonts w:ascii="Times New Roman" w:hAnsi="Times New Roman"/>
+                <w:sz w:val="15"/>
+              </w:rPr>
             </w:r>
           </w:p>
         </w:tc>
@@ -4352,13 +4353,14 @@
             <w:tcW w:type="dxa" w:w="3120"/>
           </w:tcPr>
           <w:p>
-            <w:r/>
-            <w:r>
-              <w:rPr>
-                <w:rFonts w:ascii="Times New Roman" w:hAnsi="Times New Roman"/>
-                <w:sz w:val="15"/>
-              </w:rPr>
-              <w:t>16-09-2026</w:t>
+            <w:r>
+              <w:t>10-09-2026</w:t>
+            </w:r>
+            <w:r>
+              <w:rPr>
+                <w:rFonts w:ascii="Times New Roman" w:hAnsi="Times New Roman"/>
+                <w:sz w:val="15"/>
+              </w:rPr>
             </w:r>
           </w:p>
         </w:tc>
@@ -4399,13 +4401,14 @@
             <w:tcW w:type="dxa" w:w="3120"/>
           </w:tcPr>
           <w:p>
-            <w:r/>
-            <w:r>
-              <w:rPr>
-                <w:rFonts w:ascii="Times New Roman" w:hAnsi="Times New Roman"/>
-                <w:sz w:val="15"/>
-              </w:rPr>
-              <w:t>16-09-2026</w:t>
+            <w:r>
+              <w:t>10-09-2026</w:t>
+            </w:r>
+            <w:r>
+              <w:rPr>
+                <w:rFonts w:ascii="Times New Roman" w:hAnsi="Times New Roman"/>
+                <w:sz w:val="15"/>
+              </w:rPr>
             </w:r>
           </w:p>
         </w:tc>
@@ -4446,13 +4449,14 @@
             <w:tcW w:type="dxa" w:w="3120"/>
           </w:tcPr>
           <w:p>
-            <w:r/>
-            <w:r>
-              <w:rPr>
-                <w:rFonts w:ascii="Times New Roman" w:hAnsi="Times New Roman"/>
-                <w:sz w:val="15"/>
-              </w:rPr>
-              <w:t>16-09-2026</w:t>
+            <w:r>
+              <w:t>11-09-2026</w:t>
+            </w:r>
+            <w:r>
+              <w:rPr>
+                <w:rFonts w:ascii="Times New Roman" w:hAnsi="Times New Roman"/>
+                <w:sz w:val="15"/>
+              </w:rPr>
             </w:r>
           </w:p>
         </w:tc>
@@ -4493,13 +4497,14 @@
             <w:tcW w:type="dxa" w:w="3120"/>
           </w:tcPr>
           <w:p>
-            <w:r/>
-            <w:r>
-              <w:rPr>
-                <w:rFonts w:ascii="Times New Roman" w:hAnsi="Times New Roman"/>
-                <w:sz w:val="15"/>
-              </w:rPr>
-              <w:t>17-09-2026</w:t>
+            <w:r>
+              <w:t>11-09-2026</w:t>
+            </w:r>
+            <w:r>
+              <w:rPr>
+                <w:rFonts w:ascii="Times New Roman" w:hAnsi="Times New Roman"/>
+                <w:sz w:val="15"/>
+              </w:rPr>
             </w:r>
           </w:p>
         </w:tc>
@@ -4540,13 +4545,14 @@
             <w:tcW w:type="dxa" w:w="3120"/>
           </w:tcPr>
           <w:p>
-            <w:r/>
-            <w:r>
-              <w:rPr>
-                <w:rFonts w:ascii="Times New Roman" w:hAnsi="Times New Roman"/>
-                <w:sz w:val="15"/>
-              </w:rPr>
-              <w:t>17-09-2026</w:t>
+            <w:r>
+              <w:t>12-09-2026</w:t>
+            </w:r>
+            <w:r>
+              <w:rPr>
+                <w:rFonts w:ascii="Times New Roman" w:hAnsi="Times New Roman"/>
+                <w:sz w:val="15"/>
+              </w:rPr>
             </w:r>
           </w:p>
         </w:tc>
@@ -4587,13 +4593,14 @@
             <w:tcW w:type="dxa" w:w="3120"/>
           </w:tcPr>
           <w:p>
-            <w:r/>
-            <w:r>
-              <w:rPr>
-                <w:rFonts w:ascii="Times New Roman" w:hAnsi="Times New Roman"/>
-                <w:sz w:val="15"/>
-              </w:rPr>
-              <w:t>18-09-2026</w:t>
+            <w:r>
+              <w:t>12-09-2026</w:t>
+            </w:r>
+            <w:r>
+              <w:rPr>
+                <w:rFonts w:ascii="Times New Roman" w:hAnsi="Times New Roman"/>
+                <w:sz w:val="15"/>
+              </w:rPr>
             </w:r>
           </w:p>
         </w:tc>
@@ -4634,13 +4641,14 @@
             <w:tcW w:type="dxa" w:w="3120"/>
           </w:tcPr>
           <w:p>
-            <w:r/>
-            <w:r>
-              <w:rPr>
-                <w:rFonts w:ascii="Times New Roman" w:hAnsi="Times New Roman"/>
-                <w:sz w:val="15"/>
-              </w:rPr>
-              <w:t>18-09-2026</w:t>
+            <w:r>
+              <w:t>13-09-2026</w:t>
+            </w:r>
+            <w:r>
+              <w:rPr>
+                <w:rFonts w:ascii="Times New Roman" w:hAnsi="Times New Roman"/>
+                <w:sz w:val="15"/>
+              </w:rPr>
             </w:r>
           </w:p>
         </w:tc>
@@ -4681,13 +4689,14 @@
             <w:tcW w:type="dxa" w:w="3120"/>
           </w:tcPr>
           <w:p>
-            <w:r/>
-            <w:r>
-              <w:rPr>
-                <w:rFonts w:ascii="Times New Roman" w:hAnsi="Times New Roman"/>
-                <w:sz w:val="15"/>
-              </w:rPr>
-              <w:t>19-09-2026</w:t>
+            <w:r>
+              <w:t>14-09-2026</w:t>
+            </w:r>
+            <w:r>
+              <w:rPr>
+                <w:rFonts w:ascii="Times New Roman" w:hAnsi="Times New Roman"/>
+                <w:sz w:val="15"/>
+              </w:rPr>
             </w:r>
           </w:p>
         </w:tc>
@@ -4728,13 +4737,14 @@
             <w:tcW w:type="dxa" w:w="3120"/>
           </w:tcPr>
           <w:p>
-            <w:r/>
-            <w:r>
-              <w:rPr>
-                <w:rFonts w:ascii="Times New Roman" w:hAnsi="Times New Roman"/>
-                <w:sz w:val="15"/>
-              </w:rPr>
-              <w:t>19-09-2026</w:t>
+            <w:r>
+              <w:t>15-09-2026</w:t>
+            </w:r>
+            <w:r>
+              <w:rPr>
+                <w:rFonts w:ascii="Times New Roman" w:hAnsi="Times New Roman"/>
+                <w:sz w:val="15"/>
+              </w:rPr>
             </w:r>
           </w:p>
         </w:tc>

</xml_diff>